<commit_message>
agregue el diagrama en word
</commit_message>
<xml_diff>
--- a/TPI ASI.docx
+++ b/TPI ASI.docx
@@ -16,7 +16,7 @@
       <w:r>
         <w:rPr>
           <w:noProof/>
-          <w:lang w:val="es-AR"/>
+          <w:lang w:val="es-MX" w:eastAsia="es-MX"/>
         </w:rPr>
         <w:drawing>
           <wp:anchor distT="19050" distB="19050" distL="19050" distR="19050" simplePos="0" relativeHeight="251658240" behindDoc="0" locked="0" layoutInCell="1" hidden="0" allowOverlap="1" wp14:anchorId="286926C2" wp14:editId="6500A902">
@@ -515,7 +515,7 @@
       <w:r>
         <w:rPr>
           <w:noProof/>
-          <w:lang w:val="es-AR"/>
+          <w:lang w:val="es-MX" w:eastAsia="es-MX"/>
         </w:rPr>
         <w:drawing>
           <wp:anchor distT="114300" distB="114300" distL="114300" distR="114300" simplePos="0" relativeHeight="251659264" behindDoc="0" locked="0" layoutInCell="1" hidden="0" allowOverlap="1" wp14:anchorId="65609079" wp14:editId="449352EA">
@@ -701,13 +701,8 @@
         <w:jc w:val="both"/>
       </w:pPr>
       <w:r>
-        <w:t xml:space="preserve">Franco </w:t>
-      </w:r>
-      <w:proofErr w:type="spellStart"/>
-      <w:r>
-        <w:t>Fabatia</w:t>
-      </w:r>
-      <w:proofErr w:type="spellEnd"/>
+        <w:t>Franco Fabatia</w:t>
+      </w:r>
       <w:r>
         <w:tab/>
       </w:r>
@@ -898,10 +893,7 @@
         <w:jc w:val="both"/>
       </w:pPr>
       <w:r>
-        <w:t>Ma</w:t>
-      </w:r>
-      <w:r>
-        <w:t xml:space="preserve">rtin Pedro </w:t>
+        <w:t xml:space="preserve">Martin Pedro </w:t>
       </w:r>
       <w:proofErr w:type="spellStart"/>
       <w:r>
@@ -1109,15 +1101,7 @@
           <w:sz w:val="24"/>
           <w:szCs w:val="24"/>
         </w:rPr>
-        <w:t>El Trabajo Práctic</w:t>
-      </w:r>
-      <w:r>
-        <w:rPr>
-          <w:rFonts w:eastAsia="Times New Roman"/>
-          <w:sz w:val="24"/>
-          <w:szCs w:val="24"/>
-        </w:rPr>
-        <w:t xml:space="preserve">o Integrador consiste en analizar un sistema de organización de retiros para el goce de aquellos que necesitan despejarse de la vida rutinaria. </w:t>
+        <w:t xml:space="preserve">El Trabajo Práctico Integrador consiste en analizar un sistema de organización de retiros para el goce de aquellos que necesitan despejarse de la vida rutinaria. </w:t>
       </w:r>
     </w:p>
     <w:p>
@@ -1156,15 +1140,7 @@
           <w:sz w:val="24"/>
           <w:szCs w:val="24"/>
         </w:rPr>
-        <w:t>la aplicación y la relación de los contenidos desarrollados a lo la</w:t>
-      </w:r>
-      <w:r>
-        <w:rPr>
-          <w:rFonts w:eastAsia="Times New Roman"/>
-          <w:sz w:val="24"/>
-          <w:szCs w:val="24"/>
-        </w:rPr>
-        <w:t xml:space="preserve">rgo del programa de la cátedra e integrar los conocimientos adquiridos en las materias verticales y horizontales. </w:t>
+        <w:t xml:space="preserve">la aplicación y la relación de los contenidos desarrollados a lo largo del programa de la cátedra e integrar los conocimientos adquiridos en las materias verticales y horizontales. </w:t>
       </w:r>
     </w:p>
     <w:p>
@@ -1185,15 +1161,7 @@
           <w:sz w:val="24"/>
           <w:szCs w:val="24"/>
         </w:rPr>
-        <w:t>El desarrollo abarca las actividades de modelado del dominio hasta las actividades de especificación de requisitos del sistema de software qu</w:t>
-      </w:r>
-      <w:r>
-        <w:rPr>
-          <w:rFonts w:eastAsia="Times New Roman"/>
-          <w:sz w:val="24"/>
-          <w:szCs w:val="24"/>
-        </w:rPr>
-        <w:t xml:space="preserve">e le dará soporte a los procesos de negocio principales. </w:t>
+        <w:t xml:space="preserve">El desarrollo abarca las actividades de modelado del dominio hasta las actividades de especificación de requisitos del sistema de software que le dará soporte a los procesos de negocio principales. </w:t>
       </w:r>
     </w:p>
     <w:p>
@@ -1306,14 +1274,7 @@
           <w:b/>
           <w:bCs/>
         </w:rPr>
-        <w:t>R</w:t>
-      </w:r>
-      <w:r>
-        <w:rPr>
-          <w:b/>
-          <w:bCs/>
-        </w:rPr>
-        <w:t>etirARTE</w:t>
+        <w:t>RetirARTE</w:t>
       </w:r>
       <w:proofErr w:type="spellEnd"/>
       <w:r>
@@ -1357,53 +1318,25 @@
           <w:b/>
           <w:bCs/>
         </w:rPr>
-        <w:t>El sistema al momento de iniciar se requiere que se ingrese los datos personales de la persona que va a realizar el retiro: Nombre, Apellido, DNI, teléfono, mail. Post</w:t>
-      </w:r>
-      <w:r>
-        <w:rPr>
-          <w:b/>
-          <w:bCs/>
-        </w:rPr>
-        <w:t>eriormente seleccionar el retiro</w:t>
-      </w:r>
-      <w:r>
-        <w:rPr>
-          <w:b/>
-          <w:bCs/>
-        </w:rPr>
-        <w:t xml:space="preserve"> que desee, la aplicación le permite agregar algunas observaciones adicionales (como sea el caso de un acompañante de viaje).</w:t>
-      </w:r>
-    </w:p>
-    <w:p>
-      <w:pPr>
-        <w:shd w:val="clear" w:color="auto" w:fill="FFFFFF"/>
-        <w:spacing w:before="120" w:after="120" w:line="360" w:lineRule="auto"/>
-        <w:jc w:val="both"/>
-        <w:rPr>
-          <w:b/>
-          <w:bCs/>
-        </w:rPr>
-      </w:pPr>
-      <w:r>
-        <w:rPr>
-          <w:b/>
-          <w:bCs/>
-        </w:rPr>
-        <w:t>Esta misma cuenta con una agenda que le permite visualizar todos los retiros que a realización junto a su duración, además podrá ver toda</w:t>
-      </w:r>
-      <w:r>
-        <w:rPr>
-          <w:b/>
-          <w:bCs/>
-        </w:rPr>
-        <w:t>s</w:t>
-      </w:r>
-      <w:r>
-        <w:rPr>
-          <w:b/>
-          <w:bCs/>
-        </w:rPr>
-        <w:t xml:space="preserve"> las características que tiene en el momento que desee, El sistema consta con un apartado el cual se podrá visualizar el total de gastos que se lleva en retiros, cada una con su descripción para facilitar el control económico de cada cliente.</w:t>
+        <w:t>El sistema al momento de iniciar se requiere que se ingrese los datos personales de la persona que va a realizar el retiro: Nombre, Apellido, DNI, teléfono, mail. Posteriormente seleccionar el retiro que desee, la aplicación le permite agregar algunas observaciones adicionales (como sea el caso de un acompañante de viaje).</w:t>
+      </w:r>
+    </w:p>
+    <w:p>
+      <w:pPr>
+        <w:shd w:val="clear" w:color="auto" w:fill="FFFFFF"/>
+        <w:spacing w:before="120" w:after="120" w:line="360" w:lineRule="auto"/>
+        <w:jc w:val="both"/>
+        <w:rPr>
+          <w:b/>
+          <w:bCs/>
+        </w:rPr>
+      </w:pPr>
+      <w:r>
+        <w:rPr>
+          <w:b/>
+          <w:bCs/>
+        </w:rPr>
+        <w:t>Esta misma cuenta con una agenda que le permite visualizar todos los retiros que a realización junto a su duración, además podrá ver todas las características que tiene en el momento que desee, El sistema consta con un apartado el cual se podrá visualizar el total de gastos que se lleva en retiros, cada una con su descripción para facilitar el control económico de cada cliente.</w:t>
       </w:r>
     </w:p>
     <w:p>
@@ -1488,14 +1421,7 @@
             <w:color w:val="1155CC"/>
             <w:u w:val="single"/>
           </w:rPr>
-          <w:t>Directorio d</w:t>
-        </w:r>
-        <w:r>
-          <w:rPr>
-            <w:color w:val="1155CC"/>
-            <w:u w:val="single"/>
-          </w:rPr>
-          <w:t>e Retiros de Silencio en Argentina - Retiros de Silencio en Argentina</w:t>
+          <w:t>Directorio de Retiros de Silencio en Argentina - Retiros de Silencio en Argentina</w:t>
         </w:r>
       </w:hyperlink>
       <w:r>
@@ -1514,6 +1440,41 @@
         <w:shd w:val="clear" w:color="auto" w:fill="FFFFFF"/>
         <w:spacing w:before="120" w:after="120" w:line="360" w:lineRule="auto"/>
         <w:jc w:val="both"/>
+      </w:pPr>
+    </w:p>
+    <w:p>
+      <w:pPr>
+        <w:shd w:val="clear" w:color="auto" w:fill="FFFFFF"/>
+        <w:spacing w:before="120" w:after="120" w:line="360" w:lineRule="auto"/>
+        <w:jc w:val="both"/>
+      </w:pPr>
+    </w:p>
+    <w:p>
+      <w:pPr>
+        <w:shd w:val="clear" w:color="auto" w:fill="FFFFFF"/>
+        <w:spacing w:before="120" w:after="120" w:line="360" w:lineRule="auto"/>
+        <w:jc w:val="both"/>
+      </w:pPr>
+    </w:p>
+    <w:p>
+      <w:pPr>
+        <w:shd w:val="clear" w:color="auto" w:fill="FFFFFF"/>
+        <w:spacing w:before="120" w:after="120" w:line="360" w:lineRule="auto"/>
+        <w:jc w:val="both"/>
+      </w:pPr>
+    </w:p>
+    <w:p>
+      <w:pPr>
+        <w:shd w:val="clear" w:color="auto" w:fill="FFFFFF"/>
+        <w:spacing w:before="120" w:after="120" w:line="360" w:lineRule="auto"/>
+        <w:jc w:val="both"/>
+      </w:pPr>
+    </w:p>
+    <w:p>
+      <w:pPr>
+        <w:shd w:val="clear" w:color="auto" w:fill="FFFFFF"/>
+        <w:spacing w:before="120" w:after="120" w:line="360" w:lineRule="auto"/>
+        <w:jc w:val="both"/>
         <w:rPr>
           <w:u w:val="single"/>
         </w:rPr>
@@ -1522,6 +1483,7 @@
         <w:rPr>
           <w:u w:val="single"/>
         </w:rPr>
+        <w:lastRenderedPageBreak/>
         <w:t>Objetivo del dominio</w:t>
       </w:r>
     </w:p>
@@ -1535,24 +1497,89 @@
         <w:t xml:space="preserve">   </w:t>
       </w:r>
       <w:r>
-        <w:t xml:space="preserve"> El objetivo principal es fa</w:t>
-      </w:r>
+        <w:t xml:space="preserve"> El objetivo principal es facilitar la organización de la información brindada por los usuarios en base a los retiros que participa y un mejor control sobre los gastos y planificaciones a futuros planes de retiro.</w:t>
+      </w:r>
+    </w:p>
+    <w:p>
+      <w:pPr>
+        <w:shd w:val="clear" w:color="auto" w:fill="FFFFFF"/>
+        <w:spacing w:before="120" w:after="120" w:line="360" w:lineRule="auto"/>
+        <w:jc w:val="both"/>
+      </w:pPr>
+    </w:p>
+    <w:p>
+      <w:pPr>
+        <w:shd w:val="clear" w:color="auto" w:fill="FFFFFF"/>
+        <w:spacing w:before="120" w:after="120" w:line="360" w:lineRule="auto"/>
+        <w:jc w:val="both"/>
+      </w:pPr>
+      <w:r>
+        <w:pict w14:anchorId="574FD8F4">
+          <v:shapetype id="_x0000_t75" coordsize="21600,21600" o:spt="75" o:preferrelative="t" path="m@4@5l@4@11@9@11@9@5xe" filled="f" stroked="f">
+            <v:stroke joinstyle="miter"/>
+            <v:formulas>
+              <v:f eqn="if lineDrawn pixelLineWidth 0"/>
+              <v:f eqn="sum @0 1 0"/>
+              <v:f eqn="sum 0 0 @1"/>
+              <v:f eqn="prod @2 1 2"/>
+              <v:f eqn="prod @3 21600 pixelWidth"/>
+              <v:f eqn="prod @3 21600 pixelHeight"/>
+              <v:f eqn="sum @0 0 1"/>
+              <v:f eqn="prod @6 1 2"/>
+              <v:f eqn="prod @7 21600 pixelWidth"/>
+              <v:f eqn="sum @8 21600 0"/>
+              <v:f eqn="prod @7 21600 pixelHeight"/>
+              <v:f eqn="sum @10 21600 0"/>
+            </v:formulas>
+            <v:path o:extrusionok="f" gradientshapeok="t" o:connecttype="rect"/>
+            <o:lock v:ext="edit" aspectratio="t"/>
+          </v:shapetype>
+          <v:shape id="_x0000_i1027" type="#_x0000_t75" style="width:450.75pt;height:389.25pt">
+            <v:imagedata r:id="rId18" o:title="TPI - ASI"/>
+          </v:shape>
+        </w:pict>
+      </w:r>
+    </w:p>
+    <w:p>
+      <w:pPr>
+        <w:shd w:val="clear" w:color="auto" w:fill="FFFFFF"/>
+        <w:spacing w:before="120" w:after="120" w:line="360" w:lineRule="auto"/>
+        <w:jc w:val="both"/>
+      </w:pPr>
+    </w:p>
+    <w:p>
+      <w:pPr>
+        <w:shd w:val="clear" w:color="auto" w:fill="FFFFFF"/>
+        <w:spacing w:before="120" w:after="120" w:line="360" w:lineRule="auto"/>
+        <w:jc w:val="both"/>
+      </w:pPr>
+    </w:p>
+    <w:p>
+      <w:pPr>
+        <w:shd w:val="clear" w:color="auto" w:fill="FFFFFF"/>
+        <w:spacing w:before="120" w:after="120" w:line="360" w:lineRule="auto"/>
+        <w:jc w:val="both"/>
+      </w:pPr>
+    </w:p>
+    <w:p>
+      <w:pPr>
+        <w:shd w:val="clear" w:color="auto" w:fill="FFFFFF"/>
+        <w:spacing w:before="120" w:after="120" w:line="360" w:lineRule="auto"/>
+        <w:jc w:val="both"/>
+      </w:pPr>
+    </w:p>
+    <w:p>
+      <w:pPr>
+        <w:shd w:val="clear" w:color="auto" w:fill="FFFFFF"/>
+        <w:spacing w:before="120" w:after="120" w:line="360" w:lineRule="auto"/>
+        <w:jc w:val="both"/>
+      </w:pPr>
       <w:bookmarkStart w:id="0" w:name="_GoBack"/>
       <w:bookmarkEnd w:id="0"/>
-      <w:r>
-        <w:t>cilitar la organización de la información brindada por los usuarios en base a los retiros que participa y un mejor control sobre los gastos y planificaciones a futuros planes de retiro.</w:t>
-      </w:r>
-    </w:p>
-    <w:p>
-      <w:pPr>
-        <w:shd w:val="clear" w:color="auto" w:fill="FFFFFF"/>
-        <w:spacing w:before="120" w:after="120" w:line="360" w:lineRule="auto"/>
-        <w:jc w:val="both"/>
-      </w:pPr>
     </w:p>
     <w:sectPr>
-      <w:headerReference w:type="default" r:id="rId18"/>
-      <w:footerReference w:type="default" r:id="rId19"/>
+      <w:headerReference w:type="default" r:id="rId19"/>
+      <w:footerReference w:type="default" r:id="rId20"/>
       <w:pgSz w:w="11909" w:h="16834"/>
       <w:pgMar w:top="1440" w:right="1440" w:bottom="1440" w:left="1440" w:header="720" w:footer="720" w:gutter="0"/>
       <w:pgNumType w:start="1"/>
@@ -1616,15 +1643,7 @@
     </w:pPr>
     <w:r>
       <w:tab/>
-      <w:t xml:space="preserve">Arriola - </w:t>
-    </w:r>
-    <w:proofErr w:type="spellStart"/>
-    <w:r>
-      <w:t>Fabatia</w:t>
-    </w:r>
-    <w:proofErr w:type="spellEnd"/>
-    <w:r>
-      <w:t xml:space="preserve"> - </w:t>
+      <w:t xml:space="preserve">Arriola - Fabatia - </w:t>
     </w:r>
     <w:proofErr w:type="spellStart"/>
     <w:r>
@@ -1703,7 +1722,7 @@
     <w:r>
       <w:rPr>
         <w:noProof/>
-        <w:lang w:val="es-AR"/>
+        <w:lang w:val="es-MX" w:eastAsia="es-MX"/>
       </w:rPr>
       <w:drawing>
         <wp:anchor distT="19050" distB="19050" distL="19050" distR="19050" simplePos="0" relativeHeight="251658240" behindDoc="1" locked="0" layoutInCell="1" hidden="0" allowOverlap="1" wp14:anchorId="5BFF2994" wp14:editId="66EAE7BB">

</xml_diff>